<commit_message>
feat: dong bo de kiem tra chinh thuc 20 cau trung khop 100% voi KHBD Tuan 10 cho tat ca cac khoi Lop 3-8
</commit_message>
<xml_diff>
--- a/KHBD_Tin_học/Lớp_5/Tuần_10/De_kiem_tra_DGDK1_Tin_hoc_Lop_5.docx
+++ b/KHBD_Tin_học/Lớp_5/Tuần_10/De_kiem_tra_DGDK1_Tin_hoc_Lop_5.docx
@@ -1367,7 +1367,11 @@
         <w:t>D. Chụp ảnh</w:t>
       </w:r>
     </w:p>
-    <w:p/>
+    <w:p>
+      <w:r>
+        <w:br w:type="page"/>
+      </w:r>
+    </w:p>
     <w:p>
       <w:pPr>
         <w:spacing w:before="160" w:after="80"/>
@@ -1377,6 +1381,7 @@
           <w:b/>
           <w:bCs/>
         </w:rPr>
+        <w:lastRenderedPageBreak/>
         <w:t>PHẦN II. THỰC HÀNH VÀ BÀI TẬP (2 câu – 5,0 điểm)</w:t>
       </w:r>
     </w:p>
@@ -1416,7 +1421,6 @@
         <w:ind w:left="360"/>
       </w:pPr>
       <w:r>
-        <w:lastRenderedPageBreak/>
         <w:t>c) Tạo 1 tệp văn bản Word tên 'BaiTap1.docx' đặt bên trong thư mục 'TIN_HOC'. (0,75 điểm)</w:t>
       </w:r>
     </w:p>
@@ -1587,9 +1591,9 @@
       </w:r>
     </w:p>
     <w:p>
-      <w:pPr>
-        <w:spacing w:after="160"/>
-      </w:pPr>
+      <w:r>
+        <w:br w:type="page"/>
+      </w:r>
     </w:p>
     <w:p>
       <w:pPr>
@@ -1601,6 +1605,7 @@
           <w:b/>
           <w:bCs/>
         </w:rPr>
+        <w:lastRenderedPageBreak/>
         <w:t>ĐÁP ÁN VÀ HƯỚNG DẪN CHẤM</w:t>
       </w:r>
     </w:p>
@@ -2169,7 +2174,6 @@
                 <w:b/>
                 <w:sz w:val="20"/>
               </w:rPr>
-              <w:lastRenderedPageBreak/>
               <w:t>Câu 11</w:t>
             </w:r>
           </w:p>

</xml_diff>